<commit_message>
refactor: universalize skill topic and make docx generator dynamic
- Refactor generar_monografia_docx.py into a dynamic Markdown-to-DOCX compiler
- Decontaminate templates/apa7ma.docx with neutral institutional placeholders
- Add Golden Rule 0 in SKILL.md enforcing absolute topic agnosticism across disciplines
- Update references and docx guides with neutrality guidelines
- Clean .gitignore and add output/.gitkeep for fresh repository clones
</commit_message>
<xml_diff>
--- a/skills/max-academic-bolivia/templates/apa7ma.docx
+++ b/skills/max-academic-bolivia/templates/apa7ma.docx
@@ -11,11 +11,6 @@
         </w:rPr>
       </w:pPr>
       <w:r>
-        <w:rPr>
-          <w:b/>
-          <w:sz w:val="26"/>
-          <w:lang w:val="es-MX"/>
-        </w:rPr>
         <w:t>UNIVERSIDAD AUTÓNOMA GABRIEL RENÉ MORENO</w:t>
       </w:r>
     </w:p>
@@ -28,11 +23,7 @@
         </w:rPr>
       </w:pPr>
       <w:r>
-        <w:rPr>
-          <w:b/>
-          <w:lang w:val="es-MX"/>
-        </w:rPr>
-        <w:t>FACULTAD INTEGRAL DEL NORTE</w:t>
+        <w:t>FACULTAD INTEGRAL DEL NORTE (FINOR)</w:t>
       </w:r>
     </w:p>
     <w:p>
@@ -44,11 +35,7 @@
         </w:rPr>
       </w:pPr>
       <w:r>
-        <w:rPr>
-          <w:b/>
-          <w:lang w:val="es-MX"/>
-        </w:rPr>
-        <w:t>ESCUELA DE INGENIERÍA Y POSTGRADO (EIP)</w:t>
+        <w:t>ESCUELA INTEGRAL DE POSTGRADO (EIP)</w:t>
       </w:r>
     </w:p>
     <w:p>
@@ -60,23 +47,8 @@
         </w:rPr>
       </w:pPr>
       <w:r>
-        <w:rPr>
-          <w:i/>
-          <w:sz w:val="20"/>
-          <w:lang w:val="es-MX"/>
-        </w:rPr>
-        <w:t xml:space="preserve">[ LOGO INSTITUCIONAL </w:t>
+        <w:t>[ LOGO INSTITUCIONAL UAGRM ]</w:t>
       </w:r>
-      <w:proofErr w:type="gramStart"/>
-      <w:r>
-        <w:rPr>
-          <w:i/>
-          <w:sz w:val="20"/>
-          <w:lang w:val="es-MX"/>
-        </w:rPr>
-        <w:t>UAGRM ]</w:t>
-      </w:r>
-      <w:proofErr w:type="gramEnd"/>
     </w:p>
     <w:p>
       <w:pPr>
@@ -87,11 +59,7 @@
         </w:rPr>
       </w:pPr>
       <w:r>
-        <w:rPr>
-          <w:b/>
-          <w:lang w:val="es-MX"/>
-        </w:rPr>
-        <w:t>DIPLOMADO EN ADMINISTRACIÓN DE BASES DE DATOS Y REDES</w:t>
+        <w:t>DIPLOMADO EN [NOMBRE DEL PROGRAMA O DIPLOMADO]</w:t>
       </w:r>
     </w:p>
     <w:p>
@@ -102,14 +70,7 @@
           <w:lang w:val="es-MX"/>
         </w:rPr>
       </w:pPr>
-      <w:r>
-        <w:rPr>
-          <w:b/>
-          <w:sz w:val="22"/>
-          <w:lang w:val="es-MX"/>
-        </w:rPr>
-        <w:t>MENCIÓN: SEGURIDAD</w:t>
-      </w:r>
+      <w:r/>
     </w:p>
     <w:p>
       <w:pPr>
@@ -121,13 +82,7 @@
         </w:rPr>
       </w:pPr>
       <w:r>
-        <w:rPr>
-          <w:b/>
-          <w:sz w:val="28"/>
-          <w:u w:val="single"/>
-          <w:lang w:val="es-MX"/>
-        </w:rPr>
-        <w:t>AUDITORÍA DE SEGURIDAD Y ANÁLISIS DE RIESGOS EN BASES DE DATOS RELACIONALES DENTRO DE ENTORNOS CONTENERIZADOS ASISTIDA POR AGENTES INTELIGENTES</w:t>
+        <w:t>[TÍTULO DE LA MONOGRAFÍA EN MAYÚSCULAS Y MINÚSCULAS]</w:t>
       </w:r>
     </w:p>
     <w:p>
@@ -139,12 +94,7 @@
         </w:rPr>
       </w:pPr>
       <w:r>
-        <w:rPr>
-          <w:i/>
-          <w:sz w:val="22"/>
-          <w:lang w:val="es-MX"/>
-        </w:rPr>
-        <w:t>Monografía de Compilación presentada para optar al Certificado de Diplomado</w:t>
+        <w:t>Monografía de Compilación presentada para optar al título de Diplomado en [Nombre del Programa]</w:t>
       </w:r>
     </w:p>
     <w:p>
@@ -156,18 +106,7 @@
         </w:rPr>
       </w:pPr>
       <w:r>
-        <w:rPr>
-          <w:b/>
-          <w:lang w:val="es-MX"/>
-        </w:rPr>
-        <w:t>Postgraduante: Marcos</w:t>
-      </w:r>
-      <w:r>
-        <w:rPr>
-          <w:b/>
-          <w:lang w:val="es-MX"/>
-        </w:rPr>
-        <w:t xml:space="preserve"> Leandro Bonilla Borges</w:t>
+        <w:t>Postgraduante: [Nombre Completo del Postgraduante]</w:t>
       </w:r>
     </w:p>
     <w:p>
@@ -179,10 +118,7 @@
         </w:rPr>
       </w:pPr>
       <w:r>
-        <w:rPr>
-          <w:lang w:val="es-MX"/>
-        </w:rPr>
-        <w:t>Docente Guía / Tutor: [Nombre del Tutor]</w:t>
+        <w:t>Docente Guía / Tutor: [Nombre del Docente Guía o Tutor]</w:t>
       </w:r>
     </w:p>
     <w:p>
@@ -192,6 +128,9 @@
           <w:lang w:val="es-MX"/>
         </w:rPr>
       </w:pPr>
+      <w:r>
+        <w:t>Santa Cruz de la Sierra, Bolivia, Gestión [Año]</w:t>
+      </w:r>
     </w:p>
     <w:p>
       <w:pPr>

</xml_diff>